<commit_message>
Update Projeto entrega Atualizado.docx
</commit_message>
<xml_diff>
--- a/Projeto entrega Atualizado.docx
+++ b/Projeto entrega Atualizado.docx
@@ -1455,10 +1455,7 @@
               <w:jc w:val="center"/>
             </w:pPr>
             <w:r>
-              <w:t>02</w:t>
-            </w:r>
-            <w:r>
-              <w:t>/06/2026</w:t>
+              <w:t>02/06/2026</w:t>
             </w:r>
           </w:p>
         </w:tc>
@@ -1575,13 +1572,7 @@
               <w:jc w:val="center"/>
             </w:pPr>
             <w:r>
-              <w:t>0</w:t>
-            </w:r>
-            <w:r>
-              <w:t>5</w:t>
-            </w:r>
-            <w:r>
-              <w:t>/06/2026</w:t>
+              <w:t>05/06/2026</w:t>
             </w:r>
           </w:p>
         </w:tc>
@@ -1650,19 +1641,7 @@
               <w:rPr>
                 <w:szCs w:val="20"/>
               </w:rPr>
-              <w:t>Assunto abordado é trazer mais informações sobre o que foi orientado deixando não somente a data da orientação, mas sim o que foi dado pauta, e</w:t>
-            </w:r>
-            <w:r>
-              <w:rPr>
-                <w:szCs w:val="20"/>
-              </w:rPr>
-              <w:t xml:space="preserve"> </w:t>
-            </w:r>
-            <w:r>
-              <w:rPr>
-                <w:szCs w:val="20"/>
-              </w:rPr>
-              <w:t>também pedimos orientação de como estava o andamento da documentação e o projeto em si.</w:t>
+              <w:t>Assunto abordado é trazer mais informações sobre o que foi orientado deixando não somente a data da orientação, mas sim o que foi dado pauta, e também pedimos orientação de como estava o andamento da documentação e o projeto em si.</w:t>
             </w:r>
           </w:p>
         </w:tc>
@@ -1744,13 +1723,7 @@
               <w:jc w:val="center"/>
             </w:pPr>
             <w:r>
-              <w:t>0</w:t>
-            </w:r>
-            <w:r>
-              <w:t>1</w:t>
-            </w:r>
-            <w:r>
-              <w:t>/06/2026</w:t>
+              <w:t>01/06/2026</w:t>
             </w:r>
           </w:p>
         </w:tc>
@@ -2175,10 +2148,10 @@
         <w:t>mobile e consoles</w:t>
       </w:r>
       <w:r>
-        <w:t xml:space="preserve"> e também para desktops</w:t>
-      </w:r>
-      <w:r>
-        <w:t xml:space="preserve"> do jogo atualmente conhecido como </w:t>
+        <w:t xml:space="preserve"> </w:t>
+      </w:r>
+      <w:r>
+        <w:t xml:space="preserve">do jogo atualmente conhecido como </w:t>
       </w:r>
       <w:r>
         <w:rPr>
@@ -2435,7 +2408,10 @@
         <w:ind w:right="452" w:hanging="360"/>
       </w:pPr>
       <w:r>
-        <w:t xml:space="preserve">Funções do produto: Criar novos recursos dentro do jogo. </w:t>
+        <w:t>Funções do produto: Criar novos recursos dentro do jogo</w:t>
+      </w:r>
+      <w:r>
+        <w:t>.</w:t>
       </w:r>
     </w:p>
     <w:p>
@@ -2448,39 +2424,10 @@
         <w:ind w:right="452" w:hanging="360"/>
       </w:pPr>
       <w:r>
-        <w:t xml:space="preserve">Características do usuário: Jogadores avançados e até mesmo iniciantes, interessados por uma variação ainda mais medieval. </w:t>
-      </w:r>
-    </w:p>
-    <w:p>
-      <w:pPr>
-        <w:numPr>
-          <w:ilvl w:val="0"/>
-          <w:numId w:val="4"/>
-        </w:numPr>
-        <w:spacing w:after="139"/>
-        <w:ind w:right="452" w:hanging="360"/>
-      </w:pPr>
-      <w:r>
-        <w:t xml:space="preserve">Restrições: Compatibilidade com versão </w:t>
-      </w:r>
-      <w:r>
-        <w:t>para computadores</w:t>
-      </w:r>
-      <w:r>
-        <w:t xml:space="preserve">. </w:t>
-      </w:r>
-    </w:p>
-    <w:p>
-      <w:pPr>
-        <w:numPr>
-          <w:ilvl w:val="0"/>
-          <w:numId w:val="4"/>
-        </w:numPr>
-        <w:spacing w:after="139"/>
-        <w:ind w:right="452" w:hanging="360"/>
-      </w:pPr>
-      <w:r>
-        <w:t xml:space="preserve">Suposições e dependências: Necessidade de APIs do jogo base.  </w:t>
+        <w:t>Características do usuário: Jogadores avançados e até mesmo iniciantes, interessados por uma variação ainda mais medieval</w:t>
+      </w:r>
+      <w:r>
+        <w:t>, que desejam jogar com mais opções de recursos dentro do jogo sem perder a sua essência.</w:t>
       </w:r>
     </w:p>
     <w:p>
@@ -2889,7 +2836,10 @@
         <w:ind w:right="452" w:hanging="360"/>
       </w:pPr>
       <w:r>
-        <w:t xml:space="preserve">Variação de níveis de proteção variando entre 11 e 25 </w:t>
+        <w:t xml:space="preserve">Variação de níveis de proteção variando entre 11 e </w:t>
+      </w:r>
+      <w:r>
+        <w:t>40</w:t>
       </w:r>
     </w:p>
     <w:p>
@@ -2901,7 +2851,6 @@
         <w:ind w:right="452" w:hanging="360"/>
       </w:pPr>
       <w:r>
-        <w:lastRenderedPageBreak/>
         <w:t xml:space="preserve">A junção dos dois minérios na bancada de ferraria deverá ser instantânea. </w:t>
       </w:r>
     </w:p>
@@ -2926,6 +2875,7 @@
         <w:ind w:right="452" w:hanging="360"/>
       </w:pPr>
       <w:r>
+        <w:lastRenderedPageBreak/>
         <w:t>O H</w:t>
       </w:r>
       <w:r>
@@ -2976,9 +2926,9 @@
           <w:noProof/>
         </w:rPr>
         <w:drawing>
-          <wp:inline distT="0" distB="0" distL="0" distR="0" wp14:anchorId="2DA41916" wp14:editId="1242E53A">
-            <wp:extent cx="6702425" cy="4278630"/>
-            <wp:effectExtent l="0" t="0" r="3175" b="7620"/>
+          <wp:inline distT="0" distB="0" distL="0" distR="0" wp14:anchorId="2DA41916" wp14:editId="5BD7B769">
+            <wp:extent cx="4953000" cy="3161849"/>
+            <wp:effectExtent l="0" t="0" r="0" b="635"/>
             <wp:docPr id="473990948" name="Imagem 1"/>
             <wp:cNvGraphicFramePr>
               <a:graphicFrameLocks xmlns:a="http://schemas.openxmlformats.org/drawingml/2006/main" noChangeAspect="1"/>
@@ -2999,7 +2949,7 @@
                   <pic:spPr>
                     <a:xfrm>
                       <a:off x="0" y="0"/>
-                      <a:ext cx="6702425" cy="4278630"/>
+                      <a:ext cx="4976467" cy="3176830"/>
                     </a:xfrm>
                     <a:prstGeom prst="rect">
                       <a:avLst/>
@@ -3045,9 +2995,9 @@
           <w:noProof/>
         </w:rPr>
         <w:drawing>
-          <wp:inline distT="0" distB="0" distL="0" distR="0" wp14:anchorId="2F76A9D5" wp14:editId="765E11B7">
-            <wp:extent cx="6410326" cy="4752975"/>
-            <wp:effectExtent l="0" t="0" r="0" b="0"/>
+          <wp:inline distT="0" distB="0" distL="0" distR="0" wp14:anchorId="2F76A9D5" wp14:editId="565B5816">
+            <wp:extent cx="5784850" cy="4006850"/>
+            <wp:effectExtent l="0" t="0" r="6350" b="0"/>
             <wp:docPr id="410219554" name="Picture 2961"/>
             <wp:cNvGraphicFramePr/>
             <a:graphic xmlns:a="http://schemas.openxmlformats.org/drawingml/2006/main">
@@ -3066,7 +3016,7 @@
                   <pic:spPr>
                     <a:xfrm>
                       <a:off x="0" y="0"/>
-                      <a:ext cx="6410326" cy="4752975"/>
+                      <a:ext cx="5784851" cy="4006851"/>
                     </a:xfrm>
                     <a:prstGeom prst="rect">
                       <a:avLst/>
@@ -3136,21 +3086,10 @@
         <w:t>Mobile</w:t>
       </w:r>
       <w:r>
-        <w:t xml:space="preserve"> e consoles e versão </w:t>
-      </w:r>
-      <w:proofErr w:type="spellStart"/>
-      <w:r>
-        <w:rPr>
-          <w:i/>
-        </w:rPr>
-        <w:t>Bedrock</w:t>
-      </w:r>
-      <w:proofErr w:type="spellEnd"/>
-      <w:r>
-        <w:t xml:space="preserve"> para c</w:t>
-      </w:r>
-      <w:r>
-        <w:t xml:space="preserve">omputadores). </w:t>
+        <w:t xml:space="preserve"> e consoles</w:t>
+      </w:r>
+      <w:r>
+        <w:t xml:space="preserve">). </w:t>
       </w:r>
     </w:p>
     <w:p>
@@ -3208,7 +3147,6 @@
         <w:ind w:left="-5"/>
       </w:pPr>
       <w:r>
-        <w:lastRenderedPageBreak/>
         <w:t xml:space="preserve">3.8      Interfaces de Software </w:t>
       </w:r>
     </w:p>
@@ -3279,6 +3217,7 @@
         <w:ind w:left="-5"/>
       </w:pPr>
       <w:r>
+        <w:lastRenderedPageBreak/>
         <w:t xml:space="preserve">3.9      Outros Requisitos </w:t>
       </w:r>
     </w:p>
@@ -3464,8 +3403,8 @@
     <w:tbl>
       <w:tblPr>
         <w:tblStyle w:val="TableGrid"/>
-        <w:tblW w:w="8421" w:type="dxa"/>
-        <w:tblInd w:w="301" w:type="dxa"/>
+        <w:tblW w:w="10207" w:type="dxa"/>
+        <w:tblInd w:w="-152" w:type="dxa"/>
         <w:tblCellMar>
           <w:left w:w="129" w:type="dxa"/>
           <w:bottom w:w="222" w:type="dxa"/>
@@ -3474,11 +3413,12 @@
         <w:tblLook w:val="04A0" w:firstRow="1" w:lastRow="0" w:firstColumn="1" w:lastColumn="0" w:noHBand="0" w:noVBand="1"/>
       </w:tblPr>
       <w:tblGrid>
-        <w:gridCol w:w="1698"/>
-        <w:gridCol w:w="1691"/>
-        <w:gridCol w:w="1674"/>
-        <w:gridCol w:w="1679"/>
-        <w:gridCol w:w="1679"/>
+        <w:gridCol w:w="1843"/>
+        <w:gridCol w:w="1701"/>
+        <w:gridCol w:w="1701"/>
+        <w:gridCol w:w="1701"/>
+        <w:gridCol w:w="1701"/>
+        <w:gridCol w:w="1560"/>
       </w:tblGrid>
       <w:tr>
         <w:trPr>
@@ -3486,7 +3426,7 @@
         </w:trPr>
         <w:tc>
           <w:tcPr>
-            <w:tcW w:w="1698" w:type="dxa"/>
+            <w:tcW w:w="1843" w:type="dxa"/>
             <w:tcBorders>
               <w:top w:val="single" w:sz="8" w:space="0" w:color="000000"/>
               <w:left w:val="single" w:sz="8" w:space="0" w:color="000000"/>
@@ -3506,9 +3446,9 @@
                 <w:noProof/>
               </w:rPr>
               <w:drawing>
-                <wp:inline distT="0" distB="0" distL="0" distR="0" wp14:anchorId="0CDF0DD0" wp14:editId="7A00C8CA">
-                  <wp:extent cx="702310" cy="526733"/>
-                  <wp:effectExtent l="0" t="0" r="2540" b="6985"/>
+                <wp:inline distT="0" distB="0" distL="0" distR="0" wp14:anchorId="0CDF0DD0" wp14:editId="4D0C5A9D">
+                  <wp:extent cx="701886" cy="596265"/>
+                  <wp:effectExtent l="0" t="0" r="3175" b="0"/>
                   <wp:docPr id="1098405701" name="Imagem 14"/>
                   <wp:cNvGraphicFramePr>
                     <a:graphicFrameLocks xmlns:a="http://schemas.openxmlformats.org/drawingml/2006/main" noChangeAspect="1"/>
@@ -3535,7 +3475,7 @@
                         <pic:spPr>
                           <a:xfrm>
                             <a:off x="0" y="0"/>
-                            <a:ext cx="714273" cy="535705"/>
+                            <a:ext cx="714918" cy="607336"/>
                           </a:xfrm>
                           <a:prstGeom prst="rect">
                             <a:avLst/>
@@ -3551,7 +3491,7 @@
         </w:tc>
         <w:tc>
           <w:tcPr>
-            <w:tcW w:w="1691" w:type="dxa"/>
+            <w:tcW w:w="1701" w:type="dxa"/>
             <w:tcBorders>
               <w:top w:val="single" w:sz="8" w:space="0" w:color="000000"/>
               <w:left w:val="single" w:sz="8" w:space="0" w:color="000000"/>
@@ -3570,9 +3510,9 @@
                 <w:noProof/>
               </w:rPr>
               <w:drawing>
-                <wp:inline distT="0" distB="0" distL="0" distR="0" wp14:anchorId="3D3DC3F8" wp14:editId="2D1D943B">
-                  <wp:extent cx="762000" cy="571500"/>
-                  <wp:effectExtent l="0" t="0" r="0" b="0"/>
+                <wp:inline distT="0" distB="0" distL="0" distR="0" wp14:anchorId="3D3DC3F8" wp14:editId="75A4AE32">
+                  <wp:extent cx="762000" cy="622300"/>
+                  <wp:effectExtent l="0" t="0" r="0" b="6350"/>
                   <wp:docPr id="539859257" name="Imagem 16"/>
                   <wp:cNvGraphicFramePr>
                     <a:graphicFrameLocks xmlns:a="http://schemas.openxmlformats.org/drawingml/2006/main" noChangeAspect="1"/>
@@ -3599,7 +3539,7 @@
                         <pic:spPr>
                           <a:xfrm>
                             <a:off x="0" y="0"/>
-                            <a:ext cx="764697" cy="573523"/>
+                            <a:ext cx="764698" cy="624503"/>
                           </a:xfrm>
                           <a:prstGeom prst="rect">
                             <a:avLst/>
@@ -3615,7 +3555,7 @@
         </w:tc>
         <w:tc>
           <w:tcPr>
-            <w:tcW w:w="1674" w:type="dxa"/>
+            <w:tcW w:w="1701" w:type="dxa"/>
             <w:tcBorders>
               <w:top w:val="single" w:sz="8" w:space="0" w:color="000000"/>
               <w:left w:val="single" w:sz="8" w:space="0" w:color="000000"/>
@@ -3637,9 +3577,9 @@
                 <w:noProof/>
               </w:rPr>
               <w:drawing>
-                <wp:inline distT="0" distB="0" distL="0" distR="0" wp14:anchorId="2CC1F674" wp14:editId="1712420B">
-                  <wp:extent cx="738293" cy="553720"/>
-                  <wp:effectExtent l="0" t="0" r="5080" b="0"/>
+                <wp:inline distT="0" distB="0" distL="0" distR="0" wp14:anchorId="2CC1F674" wp14:editId="06FDE5B8">
+                  <wp:extent cx="737870" cy="642303"/>
+                  <wp:effectExtent l="0" t="0" r="5080" b="5715"/>
                   <wp:docPr id="302423644" name="Imagem 17"/>
                   <wp:cNvGraphicFramePr>
                     <a:graphicFrameLocks xmlns:a="http://schemas.openxmlformats.org/drawingml/2006/main" noChangeAspect="1"/>
@@ -3666,7 +3606,7 @@
                         <pic:spPr>
                           <a:xfrm>
                             <a:off x="0" y="0"/>
-                            <a:ext cx="745866" cy="559400"/>
+                            <a:ext cx="747022" cy="650270"/>
                           </a:xfrm>
                           <a:prstGeom prst="rect">
                             <a:avLst/>
@@ -3682,7 +3622,7 @@
         </w:tc>
         <w:tc>
           <w:tcPr>
-            <w:tcW w:w="1679" w:type="dxa"/>
+            <w:tcW w:w="1701" w:type="dxa"/>
             <w:tcBorders>
               <w:top w:val="single" w:sz="8" w:space="0" w:color="000000"/>
               <w:left w:val="single" w:sz="8" w:space="0" w:color="000000"/>
@@ -3702,8 +3642,8 @@
                 <w:noProof/>
               </w:rPr>
               <w:drawing>
-                <wp:inline distT="0" distB="0" distL="0" distR="0" wp14:anchorId="0CC43E18" wp14:editId="014D3CB8">
-                  <wp:extent cx="745067" cy="558800"/>
+                <wp:inline distT="0" distB="0" distL="0" distR="0" wp14:anchorId="0CC43E18" wp14:editId="0A3C5979">
+                  <wp:extent cx="744855" cy="634841"/>
                   <wp:effectExtent l="0" t="0" r="0" b="0"/>
                   <wp:docPr id="1895718004" name="Imagem 18"/>
                   <wp:cNvGraphicFramePr>
@@ -3731,7 +3671,7 @@
                         <pic:spPr>
                           <a:xfrm>
                             <a:off x="0" y="0"/>
-                            <a:ext cx="749359" cy="562019"/>
+                            <a:ext cx="753953" cy="642595"/>
                           </a:xfrm>
                           <a:prstGeom prst="rect">
                             <a:avLst/>
@@ -3750,7 +3690,7 @@
         </w:tc>
         <w:tc>
           <w:tcPr>
-            <w:tcW w:w="1679" w:type="dxa"/>
+            <w:tcW w:w="1701" w:type="dxa"/>
             <w:tcBorders>
               <w:top w:val="single" w:sz="8" w:space="0" w:color="000000"/>
               <w:left w:val="single" w:sz="8" w:space="0" w:color="000000"/>
@@ -3770,9 +3710,9 @@
                 <w:noProof/>
               </w:rPr>
               <w:drawing>
-                <wp:inline distT="0" distB="0" distL="0" distR="0" wp14:anchorId="34D79754" wp14:editId="589AF1E8">
-                  <wp:extent cx="728133" cy="546100"/>
-                  <wp:effectExtent l="0" t="0" r="0" b="6350"/>
+                <wp:inline distT="0" distB="0" distL="0" distR="0" wp14:anchorId="34D79754" wp14:editId="4CAE3B62">
+                  <wp:extent cx="727710" cy="602933"/>
+                  <wp:effectExtent l="0" t="0" r="0" b="6985"/>
                   <wp:docPr id="1661503307" name="Imagem 19"/>
                   <wp:cNvGraphicFramePr>
                     <a:graphicFrameLocks xmlns:a="http://schemas.openxmlformats.org/drawingml/2006/main" noChangeAspect="1"/>
@@ -3799,7 +3739,7 @@
                         <pic:spPr>
                           <a:xfrm>
                             <a:off x="0" y="0"/>
-                            <a:ext cx="731742" cy="548807"/>
+                            <a:ext cx="733741" cy="607930"/>
                           </a:xfrm>
                           <a:prstGeom prst="rect">
                             <a:avLst/>
@@ -3816,6 +3756,79 @@
             </w:r>
           </w:p>
         </w:tc>
+        <w:tc>
+          <w:tcPr>
+            <w:tcW w:w="1560" w:type="dxa"/>
+            <w:tcBorders>
+              <w:top w:val="single" w:sz="4" w:space="0" w:color="auto"/>
+              <w:bottom w:val="single" w:sz="4" w:space="0" w:color="auto"/>
+              <w:right w:val="single" w:sz="4" w:space="0" w:color="auto"/>
+            </w:tcBorders>
+          </w:tcPr>
+          <w:p>
+            <w:pPr>
+              <w:spacing w:after="160" w:line="259" w:lineRule="auto"/>
+              <w:ind w:left="0" w:firstLine="0"/>
+            </w:pPr>
+          </w:p>
+          <w:p>
+            <w:pPr>
+              <w:spacing w:after="160" w:line="259" w:lineRule="auto"/>
+              <w:ind w:left="0" w:firstLine="0"/>
+              <w:jc w:val="center"/>
+            </w:pPr>
+            <w:r>
+              <w:drawing>
+                <wp:inline distT="0" distB="0" distL="0" distR="0" wp14:anchorId="5C70F44F" wp14:editId="01A2A82F">
+                  <wp:extent cx="812800" cy="603250"/>
+                  <wp:effectExtent l="0" t="0" r="6350" b="6350"/>
+                  <wp:docPr id="554554138" name="Imagem 17"/>
+                  <wp:cNvGraphicFramePr>
+                    <a:graphicFrameLocks xmlns:a="http://schemas.openxmlformats.org/drawingml/2006/main" noChangeAspect="1"/>
+                  </wp:cNvGraphicFramePr>
+                  <a:graphic xmlns:a="http://schemas.openxmlformats.org/drawingml/2006/main">
+                    <a:graphicData uri="http://schemas.openxmlformats.org/drawingml/2006/picture">
+                      <pic:pic xmlns:pic="http://schemas.openxmlformats.org/drawingml/2006/picture">
+                        <pic:nvPicPr>
+                          <pic:cNvPr id="0" name="Picture 13"/>
+                          <pic:cNvPicPr>
+                            <a:picLocks noChangeAspect="1" noChangeArrowheads="1"/>
+                          </pic:cNvPicPr>
+                        </pic:nvPicPr>
+                        <pic:blipFill>
+                          <a:blip r:embed="rId17">
+                            <a:extLst>
+                              <a:ext uri="{28A0092B-C50C-407E-A947-70E740481C1C}">
+                                <a14:useLocalDpi xmlns:a14="http://schemas.microsoft.com/office/drawing/2010/main" val="0"/>
+                              </a:ext>
+                            </a:extLst>
+                          </a:blip>
+                          <a:srcRect/>
+                          <a:stretch>
+                            <a:fillRect/>
+                          </a:stretch>
+                        </pic:blipFill>
+                        <pic:spPr bwMode="auto">
+                          <a:xfrm>
+                            <a:off x="0" y="0"/>
+                            <a:ext cx="816896" cy="606290"/>
+                          </a:xfrm>
+                          <a:prstGeom prst="rect">
+                            <a:avLst/>
+                          </a:prstGeom>
+                          <a:noFill/>
+                          <a:ln>
+                            <a:noFill/>
+                          </a:ln>
+                        </pic:spPr>
+                      </pic:pic>
+                    </a:graphicData>
+                  </a:graphic>
+                </wp:inline>
+              </w:drawing>
+            </w:r>
+          </w:p>
+        </w:tc>
       </w:tr>
     </w:tbl>
     <w:p>
@@ -3881,550 +3894,24 @@
           <w:b/>
           <w:sz w:val="22"/>
         </w:rPr>
-        <w:t xml:space="preserve">: </w:t>
-      </w:r>
-      <w:r>
-        <w:t xml:space="preserve"> </w:t>
-      </w:r>
-    </w:p>
-    <w:p>
-      <w:pPr>
-        <w:ind w:left="0" w:right="452" w:firstLine="720"/>
-      </w:pPr>
-      <w:r>
-        <w:t xml:space="preserve">Esse minério será o ponto inicial da modificação, com as únicas receitas a fabricar a fornalha potente sombria e a mesa de trabalho sombria. Para o usuário jogador adquiri-lo será necessário fundir a barra de ferro e um bloco de obsidiana na mesa de ferraria.  </w:t>
-      </w:r>
-    </w:p>
-    <w:p>
-      <w:pPr>
-        <w:spacing w:after="0" w:line="259" w:lineRule="auto"/>
-        <w:ind w:left="0" w:firstLine="0"/>
-      </w:pPr>
-      <w:r>
-        <w:t xml:space="preserve"> </w:t>
-      </w:r>
-    </w:p>
-    <w:p>
-      <w:pPr>
-        <w:numPr>
-          <w:ilvl w:val="0"/>
-          <w:numId w:val="7"/>
-        </w:numPr>
-        <w:spacing w:after="4" w:line="259" w:lineRule="auto"/>
-        <w:ind w:hanging="165"/>
-      </w:pPr>
-      <w:r>
-        <w:rPr>
-          <w:b/>
-          <w:sz w:val="22"/>
-        </w:rPr>
-        <w:t xml:space="preserve">- Minério de </w:t>
-      </w:r>
-      <w:proofErr w:type="spellStart"/>
-      <w:r>
-        <w:rPr>
-          <w:b/>
-          <w:sz w:val="22"/>
-        </w:rPr>
-        <w:t>Curiotita</w:t>
-      </w:r>
-      <w:proofErr w:type="spellEnd"/>
-      <w:r>
-        <w:rPr>
-          <w:b/>
-          <w:sz w:val="22"/>
-        </w:rPr>
-        <w:t xml:space="preserve">: </w:t>
-      </w:r>
-    </w:p>
-    <w:p>
-      <w:pPr>
-        <w:spacing w:line="259" w:lineRule="auto"/>
-        <w:ind w:left="0" w:firstLine="0"/>
-      </w:pPr>
-      <w:r>
-        <w:rPr>
-          <w:b/>
-          <w:sz w:val="22"/>
+        <w:t>:</w:t>
+      </w:r>
+    </w:p>
+    <w:p>
+      <w:pPr>
+        <w:spacing w:after="79" w:line="259" w:lineRule="auto"/>
+        <w:ind w:left="165" w:firstLine="0"/>
+      </w:pPr>
+      <w:r>
+        <w:rPr>
+          <w:noProof/>
         </w:rPr>
         <w:lastRenderedPageBreak/>
-        <w:t xml:space="preserve"> </w:t>
-      </w:r>
-    </w:p>
-    <w:p>
-      <w:pPr>
-        <w:ind w:right="452"/>
-      </w:pPr>
-      <w:r>
-        <w:rPr>
-          <w:b/>
-          <w:sz w:val="22"/>
-        </w:rPr>
-        <w:t xml:space="preserve"> </w:t>
-      </w:r>
-      <w:r>
-        <w:rPr>
-          <w:b/>
-          <w:sz w:val="22"/>
-        </w:rPr>
-        <w:tab/>
-      </w:r>
-      <w:r>
-        <w:t xml:space="preserve">Esse minério seria a camada base do mundo, como por exemplo a camada de pedra com chances de geração acima do solo, e o minério de entrada da modificação como o primeiro minério a ser adquirido pelo usuário, o jogador pode consegui-lo após o avanço dos equipamentos de diamante. </w:t>
-      </w:r>
-    </w:p>
-    <w:p>
-      <w:pPr>
-        <w:spacing w:after="0" w:line="259" w:lineRule="auto"/>
-        <w:ind w:left="0" w:firstLine="0"/>
-      </w:pPr>
-      <w:r>
-        <w:t xml:space="preserve"> </w:t>
-      </w:r>
-    </w:p>
-    <w:p>
-      <w:pPr>
-        <w:numPr>
-          <w:ilvl w:val="0"/>
-          <w:numId w:val="7"/>
-        </w:numPr>
-        <w:spacing w:after="4" w:line="259" w:lineRule="auto"/>
-        <w:ind w:hanging="165"/>
-      </w:pPr>
-      <w:r>
-        <w:rPr>
-          <w:b/>
-          <w:sz w:val="22"/>
-        </w:rPr>
-        <w:t xml:space="preserve">- Minério de </w:t>
-      </w:r>
-      <w:proofErr w:type="spellStart"/>
-      <w:r>
-        <w:rPr>
-          <w:b/>
-          <w:sz w:val="22"/>
-        </w:rPr>
-        <w:t>Nept</w:t>
-      </w:r>
-      <w:r>
-        <w:rPr>
-          <w:b/>
-          <w:sz w:val="22"/>
-        </w:rPr>
-        <w:t>ita</w:t>
-      </w:r>
-      <w:proofErr w:type="spellEnd"/>
-      <w:r>
-        <w:rPr>
-          <w:b/>
-          <w:sz w:val="22"/>
-        </w:rPr>
-        <w:t xml:space="preserve">:  </w:t>
-      </w:r>
-    </w:p>
-    <w:p>
-      <w:pPr>
-        <w:spacing w:after="24" w:line="259" w:lineRule="auto"/>
-        <w:ind w:left="0" w:firstLine="0"/>
-      </w:pPr>
-      <w:r>
-        <w:rPr>
-          <w:b/>
-          <w:sz w:val="22"/>
-        </w:rPr>
-        <w:t xml:space="preserve"> </w:t>
-      </w:r>
-      <w:r>
-        <w:rPr>
-          <w:b/>
-          <w:sz w:val="22"/>
-        </w:rPr>
-        <w:tab/>
-        <w:t xml:space="preserve"> </w:t>
-      </w:r>
-    </w:p>
-    <w:p>
-      <w:pPr>
-        <w:ind w:right="452"/>
-      </w:pPr>
-      <w:r>
-        <w:rPr>
-          <w:b/>
-          <w:sz w:val="22"/>
-        </w:rPr>
-        <w:t xml:space="preserve"> </w:t>
-      </w:r>
-      <w:r>
-        <w:rPr>
-          <w:b/>
-          <w:sz w:val="22"/>
-        </w:rPr>
-        <w:tab/>
-      </w:r>
-      <w:r>
-        <w:t>Esse minério seria um pouco mais forte e resistente que o “</w:t>
-      </w:r>
-      <w:proofErr w:type="spellStart"/>
-      <w:r>
-        <w:t>Curiotita</w:t>
-      </w:r>
-      <w:proofErr w:type="spellEnd"/>
-      <w:r>
-        <w:t>”, entraria na camada de pedra, e só pode ser adquirido após o avanço dos equipamentos de “</w:t>
-      </w:r>
-      <w:proofErr w:type="spellStart"/>
-      <w:r>
-        <w:t>Curiotita</w:t>
-      </w:r>
-      <w:proofErr w:type="spellEnd"/>
-      <w:r>
-        <w:t xml:space="preserve">”. </w:t>
-      </w:r>
-    </w:p>
-    <w:p>
-      <w:pPr>
-        <w:spacing w:after="0" w:line="259" w:lineRule="auto"/>
-        <w:ind w:left="0" w:firstLine="0"/>
-      </w:pPr>
-      <w:r>
-        <w:t xml:space="preserve"> </w:t>
-      </w:r>
-    </w:p>
-    <w:p>
-      <w:pPr>
-        <w:numPr>
-          <w:ilvl w:val="0"/>
-          <w:numId w:val="7"/>
-        </w:numPr>
-        <w:spacing w:after="4" w:line="259" w:lineRule="auto"/>
-        <w:ind w:hanging="165"/>
-      </w:pPr>
-      <w:r>
-        <w:rPr>
-          <w:b/>
-          <w:sz w:val="22"/>
-        </w:rPr>
-        <w:t xml:space="preserve">- Minério de </w:t>
-      </w:r>
-      <w:proofErr w:type="spellStart"/>
-      <w:r>
-        <w:rPr>
-          <w:b/>
-          <w:sz w:val="22"/>
-        </w:rPr>
-        <w:t>Emeritio</w:t>
-      </w:r>
-      <w:proofErr w:type="spellEnd"/>
-      <w:r>
-        <w:rPr>
-          <w:b/>
-          <w:sz w:val="22"/>
-        </w:rPr>
-        <w:t xml:space="preserve">:  </w:t>
-      </w:r>
-    </w:p>
-    <w:p>
-      <w:pPr>
-        <w:spacing w:line="259" w:lineRule="auto"/>
-        <w:ind w:left="0" w:firstLine="0"/>
-      </w:pPr>
-      <w:r>
-        <w:rPr>
-          <w:b/>
-          <w:sz w:val="22"/>
-        </w:rPr>
-        <w:t xml:space="preserve"> </w:t>
-      </w:r>
-    </w:p>
-    <w:p>
-      <w:pPr>
-        <w:ind w:right="452"/>
-      </w:pPr>
-      <w:r>
-        <w:rPr>
-          <w:b/>
-          <w:sz w:val="22"/>
-        </w:rPr>
-        <w:t xml:space="preserve"> </w:t>
-      </w:r>
-      <w:r>
-        <w:rPr>
-          <w:b/>
-          <w:sz w:val="22"/>
-        </w:rPr>
-        <w:tab/>
-      </w:r>
-      <w:r>
-        <w:t xml:space="preserve">Minério um pouco mais avançado dentro da modificação, resistência avançada e força acima de </w:t>
-      </w:r>
-      <w:proofErr w:type="spellStart"/>
-      <w:r>
-        <w:t>netherita</w:t>
-      </w:r>
-      <w:proofErr w:type="spellEnd"/>
-      <w:r>
-        <w:t>, encontrado nas camadas de ardósias abissais e com chances de geração pouco parecidas com a geração do diamante, necessário equipamentos de “</w:t>
-      </w:r>
-      <w:proofErr w:type="spellStart"/>
-      <w:r>
-        <w:t>Neptita</w:t>
-      </w:r>
-      <w:proofErr w:type="spellEnd"/>
-      <w:r>
-        <w:t xml:space="preserve">” para obtenção do minério. </w:t>
-      </w:r>
-    </w:p>
-    <w:p>
-      <w:pPr>
-        <w:spacing w:after="0" w:line="259" w:lineRule="auto"/>
-        <w:ind w:left="0" w:firstLine="0"/>
-      </w:pPr>
-      <w:r>
-        <w:t xml:space="preserve"> </w:t>
-      </w:r>
-    </w:p>
-    <w:p>
-      <w:pPr>
-        <w:numPr>
-          <w:ilvl w:val="0"/>
-          <w:numId w:val="7"/>
-        </w:numPr>
-        <w:spacing w:after="4" w:line="259" w:lineRule="auto"/>
-        <w:ind w:hanging="165"/>
-      </w:pPr>
-      <w:r>
-        <w:rPr>
-          <w:b/>
-          <w:sz w:val="22"/>
-        </w:rPr>
-        <w:t xml:space="preserve">- Minério de </w:t>
-      </w:r>
-      <w:proofErr w:type="spellStart"/>
-      <w:r>
-        <w:rPr>
-          <w:b/>
-          <w:sz w:val="22"/>
-        </w:rPr>
-        <w:t>Celesio</w:t>
-      </w:r>
-      <w:proofErr w:type="spellEnd"/>
-      <w:r>
-        <w:rPr>
-          <w:b/>
-          <w:sz w:val="22"/>
-        </w:rPr>
-        <w:t xml:space="preserve">:  </w:t>
-      </w:r>
-    </w:p>
-    <w:p>
-      <w:pPr>
-        <w:spacing w:line="259" w:lineRule="auto"/>
-        <w:ind w:left="0" w:firstLine="0"/>
-      </w:pPr>
-      <w:r>
-        <w:rPr>
-          <w:b/>
-          <w:sz w:val="22"/>
-        </w:rPr>
-        <w:t xml:space="preserve"> </w:t>
-      </w:r>
-    </w:p>
-    <w:p>
-      <w:pPr>
-        <w:spacing w:after="0" w:line="253" w:lineRule="auto"/>
-        <w:ind w:left="0" w:right="507" w:firstLine="0"/>
-      </w:pPr>
-      <w:r>
-        <w:rPr>
-          <w:b/>
-          <w:sz w:val="22"/>
-        </w:rPr>
-        <w:t xml:space="preserve"> </w:t>
-      </w:r>
-      <w:r>
-        <w:rPr>
-          <w:b/>
-          <w:sz w:val="22"/>
-        </w:rPr>
-        <w:tab/>
-      </w:r>
-      <w:r>
-        <w:t xml:space="preserve">Minério com resistência e força avançadas, encontrado no mundo comum na camada das ardósias abissais, é necessário equipamentos de </w:t>
-      </w:r>
-      <w:proofErr w:type="spellStart"/>
-      <w:r>
-        <w:t>netherita</w:t>
-      </w:r>
-      <w:proofErr w:type="spellEnd"/>
-      <w:r>
-        <w:t xml:space="preserve"> para obtenção do minério, taxa de geração um pouco menor que o minério de diamante. </w:t>
-      </w:r>
-    </w:p>
-    <w:p>
-      <w:pPr>
-        <w:spacing w:after="0" w:line="259" w:lineRule="auto"/>
-        <w:ind w:left="0" w:firstLine="0"/>
-      </w:pPr>
-      <w:r>
-        <w:t xml:space="preserve"> </w:t>
-      </w:r>
-    </w:p>
-    <w:p>
-      <w:pPr>
-        <w:spacing w:after="0" w:line="259" w:lineRule="auto"/>
-        <w:ind w:left="0" w:firstLine="0"/>
-      </w:pPr>
-      <w:r>
-        <w:t xml:space="preserve"> </w:t>
-      </w:r>
-    </w:p>
-    <w:p>
-      <w:pPr>
-        <w:numPr>
-          <w:ilvl w:val="0"/>
-          <w:numId w:val="7"/>
-        </w:numPr>
-        <w:spacing w:after="4" w:line="259" w:lineRule="auto"/>
-        <w:ind w:hanging="165"/>
-      </w:pPr>
-      <w:r>
-        <w:rPr>
-          <w:b/>
-          <w:sz w:val="22"/>
-        </w:rPr>
-        <w:t xml:space="preserve">- Minério de </w:t>
-      </w:r>
-      <w:proofErr w:type="spellStart"/>
-      <w:r>
-        <w:rPr>
-          <w:b/>
-          <w:sz w:val="22"/>
-        </w:rPr>
-        <w:t>Kharatio</w:t>
-      </w:r>
-      <w:proofErr w:type="spellEnd"/>
-      <w:r>
-        <w:rPr>
-          <w:b/>
-          <w:sz w:val="22"/>
-        </w:rPr>
-        <w:t xml:space="preserve">: </w:t>
-      </w:r>
-      <w:r>
-        <w:t xml:space="preserve"> </w:t>
-      </w:r>
-    </w:p>
-    <w:p>
-      <w:pPr>
-        <w:spacing w:after="4" w:line="259" w:lineRule="auto"/>
-        <w:ind w:left="0" w:firstLine="0"/>
-      </w:pPr>
-      <w:r>
-        <w:t xml:space="preserve"> </w:t>
-      </w:r>
-    </w:p>
-    <w:p>
-      <w:pPr>
-        <w:pStyle w:val="Ttulo2"/>
-        <w:ind w:left="-5"/>
-      </w:pPr>
-      <w:r>
-        <w:lastRenderedPageBreak/>
-        <w:t xml:space="preserve"> </w:t>
-      </w:r>
-      <w:r>
-        <w:tab/>
-        <w:t>Último e o minério mais forte da modificação, o minério é encontrado no mundo comum abaixo das camadas de ardósia abissal próximo a “</w:t>
-      </w:r>
-      <w:proofErr w:type="spellStart"/>
-      <w:r>
-        <w:t>Bedrock</w:t>
-      </w:r>
-      <w:proofErr w:type="spellEnd"/>
-      <w:r>
-        <w:t xml:space="preserve">” com a taxa de geração um pouco maior que </w:t>
-      </w:r>
-      <w:proofErr w:type="spellStart"/>
-      <w:r>
-        <w:t>netherita</w:t>
-      </w:r>
-      <w:proofErr w:type="spellEnd"/>
-      <w:r>
-        <w:t xml:space="preserve">, extraído somente com ferramentas de </w:t>
-      </w:r>
-      <w:proofErr w:type="spellStart"/>
-      <w:r>
-        <w:t>netherita</w:t>
-      </w:r>
-      <w:proofErr w:type="spellEnd"/>
-      <w:r>
-        <w:t xml:space="preserve">. </w:t>
-      </w:r>
-      <w:r>
-        <w:br/>
-      </w:r>
-      <w:r>
-        <w:br/>
-      </w:r>
-      <w:r>
-        <w:t>Exemplo d</w:t>
-      </w:r>
-      <w:r>
-        <w:t>os</w:t>
-      </w:r>
-      <w:r>
-        <w:t xml:space="preserve"> Minério</w:t>
-      </w:r>
-      <w:r>
-        <w:t>s</w:t>
-      </w:r>
-      <w:r>
-        <w:t xml:space="preserve"> desde o encontro no jogo até seu último estágio.</w:t>
-      </w:r>
-    </w:p>
-    <w:p>
-      <w:pPr>
-        <w:pStyle w:val="Ttulo2"/>
-        <w:ind w:left="-5"/>
-      </w:pPr>
-      <w:r>
-        <w:br/>
-      </w:r>
-      <w:r>
-        <w:t>5.</w:t>
-      </w:r>
-      <w:r>
-        <w:t>0</w:t>
-      </w:r>
-      <w:r>
-        <w:t xml:space="preserve">   Protótipos de Tela </w:t>
-      </w:r>
-      <w:r>
-        <w:t>(</w:t>
-      </w:r>
-      <w:proofErr w:type="spellStart"/>
-      <w:r>
-        <w:t>Alcarita</w:t>
-      </w:r>
-      <w:proofErr w:type="spellEnd"/>
-      <w:r>
-        <w:t>)</w:t>
-      </w:r>
-    </w:p>
-    <w:p>
-      <w:pPr>
-        <w:pStyle w:val="Ttulo2"/>
-        <w:ind w:left="-5"/>
-      </w:pPr>
-      <w:r>
-        <w:rPr>
-          <w:noProof/>
-        </w:rPr>
         <w:drawing>
-          <wp:inline distT="0" distB="0" distL="0" distR="0" wp14:anchorId="7ED9355C" wp14:editId="586727B3">
-            <wp:extent cx="3600450" cy="2189031"/>
-            <wp:effectExtent l="0" t="0" r="0" b="1905"/>
-            <wp:docPr id="1524511002" name="Imagem 1"/>
+          <wp:inline distT="0" distB="0" distL="0" distR="0" wp14:anchorId="20F36335" wp14:editId="68C016D3">
+            <wp:extent cx="4095750" cy="2445448"/>
+            <wp:effectExtent l="0" t="0" r="0" b="0"/>
+            <wp:docPr id="1350701771" name="Imagem 1"/>
             <wp:cNvGraphicFramePr>
               <a:graphicFrameLocks xmlns:a="http://schemas.openxmlformats.org/drawingml/2006/main" noChangeAspect="1"/>
             </wp:cNvGraphicFramePr>
@@ -4436,7 +3923,7 @@
                     <pic:cNvPicPr/>
                   </pic:nvPicPr>
                   <pic:blipFill>
-                    <a:blip r:embed="rId17"/>
+                    <a:blip r:embed="rId18"/>
                     <a:stretch>
                       <a:fillRect/>
                     </a:stretch>
@@ -4444,7 +3931,7 @@
                   <pic:spPr>
                     <a:xfrm>
                       <a:off x="0" y="0"/>
-                      <a:ext cx="3643408" cy="2215149"/>
+                      <a:ext cx="4154721" cy="2480658"/>
                     </a:xfrm>
                     <a:prstGeom prst="rect">
                       <a:avLst/>
@@ -4457,108 +3944,87 @@
         </w:drawing>
       </w:r>
       <w:r>
-        <w:br/>
-        <w:t xml:space="preserve">5.1 </w:t>
-      </w:r>
-      <w:r>
-        <w:t xml:space="preserve">Protótipos de Tela </w:t>
-      </w:r>
-      <w:r>
-        <w:t>(</w:t>
+        <w:rPr>
+          <w:b/>
+          <w:sz w:val="22"/>
+        </w:rPr>
+        <w:t xml:space="preserve"> </w:t>
+      </w:r>
+      <w:r>
+        <w:t xml:space="preserve"> </w:t>
+      </w:r>
+    </w:p>
+    <w:p>
+      <w:pPr>
+        <w:ind w:left="0" w:right="452" w:firstLine="720"/>
+      </w:pPr>
+      <w:r>
+        <w:t xml:space="preserve">Esse minério será o ponto inicial da modificação, com receitas a fabricar a fornalha potente sombria e a mesa de trabalho sombria. Para o usuário jogador adquiri-lo será necessário fundir a barra de ferro e um bloco de obsidiana na mesa de ferraria.  </w:t>
+      </w:r>
+    </w:p>
+    <w:p>
+      <w:pPr>
+        <w:spacing w:after="0" w:line="259" w:lineRule="auto"/>
+        <w:ind w:left="0" w:firstLine="0"/>
+      </w:pPr>
+      <w:r>
+        <w:t xml:space="preserve"> </w:t>
+      </w:r>
+    </w:p>
+    <w:p>
+      <w:pPr>
+        <w:numPr>
+          <w:ilvl w:val="0"/>
+          <w:numId w:val="7"/>
+        </w:numPr>
+        <w:spacing w:after="4" w:line="259" w:lineRule="auto"/>
+        <w:ind w:hanging="165"/>
+      </w:pPr>
+      <w:r>
+        <w:rPr>
+          <w:b/>
+          <w:sz w:val="22"/>
+        </w:rPr>
+        <w:t xml:space="preserve">- Minério de </w:t>
       </w:r>
       <w:proofErr w:type="spellStart"/>
       <w:r>
-        <w:t>Neptita</w:t>
+        <w:rPr>
+          <w:b/>
+          <w:sz w:val="22"/>
+        </w:rPr>
+        <w:t>Curiotita</w:t>
       </w:r>
       <w:proofErr w:type="spellEnd"/>
       <w:r>
-        <w:t>)</w:t>
-      </w:r>
-    </w:p>
-    <w:p>
-      <w:pPr>
-        <w:pStyle w:val="Ttulo2"/>
-        <w:ind w:left="-5"/>
-        <w:rPr>
-          <w:u w:val="single"/>
-        </w:rPr>
-      </w:pPr>
+        <w:rPr>
+          <w:b/>
+          <w:sz w:val="22"/>
+        </w:rPr>
+        <w:t xml:space="preserve">: </w:t>
+      </w:r>
+    </w:p>
+    <w:p>
+      <w:pPr>
+        <w:spacing w:line="259" w:lineRule="auto"/>
+        <w:ind w:left="0" w:firstLine="0"/>
+      </w:pPr>
+      <w:r>
+        <w:rPr>
+          <w:b/>
+          <w:sz w:val="22"/>
+        </w:rPr>
+        <w:t xml:space="preserve"> </w:t>
+      </w:r>
       <w:r>
         <w:rPr>
           <w:noProof/>
         </w:rPr>
-        <w:lastRenderedPageBreak/>
         <w:drawing>
-          <wp:inline distT="0" distB="0" distL="0" distR="0" wp14:anchorId="5246E1DE" wp14:editId="222E03E7">
-            <wp:extent cx="3765550" cy="2343113"/>
-            <wp:effectExtent l="0" t="0" r="6350" b="635"/>
-            <wp:docPr id="288707135" name="Imagem 1"/>
-            <wp:cNvGraphicFramePr>
-              <a:graphicFrameLocks xmlns:a="http://schemas.openxmlformats.org/drawingml/2006/main" noChangeAspect="1"/>
-            </wp:cNvGraphicFramePr>
-            <a:graphic xmlns:a="http://schemas.openxmlformats.org/drawingml/2006/main">
-              <a:graphicData uri="http://schemas.openxmlformats.org/drawingml/2006/picture">
-                <pic:pic xmlns:pic="http://schemas.openxmlformats.org/drawingml/2006/picture">
-                  <pic:nvPicPr>
-                    <pic:cNvPr id="288707135" name=""/>
-                    <pic:cNvPicPr/>
-                  </pic:nvPicPr>
-                  <pic:blipFill>
-                    <a:blip r:embed="rId18"/>
-                    <a:stretch>
-                      <a:fillRect/>
-                    </a:stretch>
-                  </pic:blipFill>
-                  <pic:spPr>
-                    <a:xfrm>
-                      <a:off x="0" y="0"/>
-                      <a:ext cx="3804948" cy="2367628"/>
-                    </a:xfrm>
-                    <a:prstGeom prst="rect">
-                      <a:avLst/>
-                    </a:prstGeom>
-                  </pic:spPr>
-                </pic:pic>
-              </a:graphicData>
-            </a:graphic>
-          </wp:inline>
-        </w:drawing>
-      </w:r>
-      <w:r>
-        <w:br/>
-      </w:r>
-      <w:r>
-        <w:t>5.</w:t>
-      </w:r>
-      <w:r>
-        <w:t>2</w:t>
-      </w:r>
-      <w:r>
-        <w:t xml:space="preserve">   Protótipos de Tela </w:t>
-      </w:r>
-      <w:r>
-        <w:t>(</w:t>
-      </w:r>
-      <w:proofErr w:type="spellStart"/>
-      <w:r>
-        <w:t>Curiotita</w:t>
-      </w:r>
-      <w:proofErr w:type="spellEnd"/>
-      <w:r>
-        <w:t>)</w:t>
-      </w:r>
-      <w:r>
-        <w:br/>
-      </w:r>
-      <w:r>
-        <w:rPr>
-          <w:noProof/>
-        </w:rPr>
-        <w:drawing>
-          <wp:inline distT="0" distB="0" distL="0" distR="0" wp14:anchorId="673C86F1" wp14:editId="752F268D">
-            <wp:extent cx="3919624" cy="1911350"/>
-            <wp:effectExtent l="0" t="0" r="5080" b="0"/>
-            <wp:docPr id="1020674573" name="Imagem 1"/>
+          <wp:inline distT="0" distB="0" distL="0" distR="0" wp14:anchorId="35332F16" wp14:editId="49DDB854">
+            <wp:extent cx="4199617" cy="2273300"/>
+            <wp:effectExtent l="0" t="0" r="0" b="0"/>
+            <wp:docPr id="1038225180" name="Imagem 1"/>
             <wp:cNvGraphicFramePr>
               <a:graphicFrameLocks xmlns:a="http://schemas.openxmlformats.org/drawingml/2006/main" noChangeAspect="1"/>
             </wp:cNvGraphicFramePr>
@@ -4578,7 +4044,7 @@
                   <pic:spPr>
                     <a:xfrm>
                       <a:off x="0" y="0"/>
-                      <a:ext cx="3926632" cy="1914767"/>
+                      <a:ext cx="4229487" cy="2289469"/>
                     </a:xfrm>
                     <a:prstGeom prst="rect">
                       <a:avLst/>
@@ -4590,41 +4056,280 @@
           </wp:inline>
         </w:drawing>
       </w:r>
-      <w:r>
-        <w:br/>
-      </w:r>
-      <w:r>
-        <w:t>5.</w:t>
-      </w:r>
-      <w:r>
-        <w:t>3</w:t>
-      </w:r>
-      <w:r>
-        <w:t xml:space="preserve">   Protótipos de Tela </w:t>
-      </w:r>
-      <w:r>
-        <w:t>(</w:t>
+    </w:p>
+    <w:p>
+      <w:pPr>
+        <w:ind w:right="452"/>
+      </w:pPr>
+      <w:r>
+        <w:rPr>
+          <w:b/>
+          <w:sz w:val="22"/>
+        </w:rPr>
+        <w:t xml:space="preserve"> </w:t>
+      </w:r>
+      <w:r>
+        <w:rPr>
+          <w:b/>
+          <w:sz w:val="22"/>
+        </w:rPr>
+        <w:tab/>
       </w:r>
       <w:proofErr w:type="spellStart"/>
       <w:r>
+        <w:t>Curiotita</w:t>
+      </w:r>
+      <w:proofErr w:type="spellEnd"/>
+      <w:r>
+        <w:t xml:space="preserve"> </w:t>
+      </w:r>
+      <w:r>
+        <w:t>se encontra</w:t>
+      </w:r>
+      <w:r>
+        <w:t xml:space="preserve"> camada base do mundo, como por exemplo a camada de pedra com chances de geração acima do solo</w:t>
+      </w:r>
+      <w:r>
+        <w:t xml:space="preserve"> e também nas ardósias abissais </w:t>
+      </w:r>
+      <w:r>
+        <w:t>surgindo desde a camada Y = 320 até a camada Y = -64</w:t>
+      </w:r>
+      <w:r>
+        <w:t xml:space="preserve">, </w:t>
+      </w:r>
+      <w:r>
+        <w:t xml:space="preserve">é </w:t>
+      </w:r>
+      <w:r>
+        <w:t xml:space="preserve">o minério de entrada da modificação como o primeiro minério a ser adquirido pelo usuário, o jogador pode consegui-lo após o avanço dos equipamentos de diamante. </w:t>
+      </w:r>
+    </w:p>
+    <w:p>
+      <w:pPr>
+        <w:spacing w:after="0" w:line="259" w:lineRule="auto"/>
+        <w:ind w:left="0" w:firstLine="0"/>
+      </w:pPr>
+      <w:r>
+        <w:t xml:space="preserve"> </w:t>
+      </w:r>
+    </w:p>
+    <w:p>
+      <w:pPr>
+        <w:numPr>
+          <w:ilvl w:val="0"/>
+          <w:numId w:val="7"/>
+        </w:numPr>
+        <w:spacing w:after="4" w:line="259" w:lineRule="auto"/>
+        <w:ind w:hanging="165"/>
+      </w:pPr>
+      <w:r>
+        <w:rPr>
+          <w:b/>
+          <w:sz w:val="22"/>
+        </w:rPr>
+        <w:t xml:space="preserve">- Minério de </w:t>
+      </w:r>
+      <w:proofErr w:type="spellStart"/>
+      <w:r>
+        <w:rPr>
+          <w:b/>
+          <w:sz w:val="22"/>
+        </w:rPr>
+        <w:t>Nept</w:t>
+      </w:r>
+      <w:r>
+        <w:rPr>
+          <w:b/>
+          <w:sz w:val="22"/>
+        </w:rPr>
+        <w:t>ita</w:t>
+      </w:r>
+      <w:proofErr w:type="spellEnd"/>
+      <w:r>
+        <w:rPr>
+          <w:b/>
+          <w:sz w:val="22"/>
+        </w:rPr>
+        <w:t>:</w:t>
+      </w:r>
+    </w:p>
+    <w:p>
+      <w:pPr>
+        <w:spacing w:after="4" w:line="259" w:lineRule="auto"/>
+        <w:ind w:left="165" w:firstLine="0"/>
+      </w:pPr>
+      <w:r>
+        <w:rPr>
+          <w:noProof/>
+        </w:rPr>
+        <w:lastRenderedPageBreak/>
+        <w:drawing>
+          <wp:inline distT="0" distB="0" distL="0" distR="0" wp14:anchorId="6F24A8BC" wp14:editId="1EFF23BB">
+            <wp:extent cx="4509378" cy="2482850"/>
+            <wp:effectExtent l="0" t="0" r="5715" b="0"/>
+            <wp:docPr id="1651121331" name="Imagem 1"/>
+            <wp:cNvGraphicFramePr>
+              <a:graphicFrameLocks xmlns:a="http://schemas.openxmlformats.org/drawingml/2006/main" noChangeAspect="1"/>
+            </wp:cNvGraphicFramePr>
+            <a:graphic xmlns:a="http://schemas.openxmlformats.org/drawingml/2006/main">
+              <a:graphicData uri="http://schemas.openxmlformats.org/drawingml/2006/picture">
+                <pic:pic xmlns:pic="http://schemas.openxmlformats.org/drawingml/2006/picture">
+                  <pic:nvPicPr>
+                    <pic:cNvPr id="288707135" name=""/>
+                    <pic:cNvPicPr/>
+                  </pic:nvPicPr>
+                  <pic:blipFill>
+                    <a:blip r:embed="rId20"/>
+                    <a:stretch>
+                      <a:fillRect/>
+                    </a:stretch>
+                  </pic:blipFill>
+                  <pic:spPr>
+                    <a:xfrm>
+                      <a:off x="0" y="0"/>
+                      <a:ext cx="4561267" cy="2511420"/>
+                    </a:xfrm>
+                    <a:prstGeom prst="rect">
+                      <a:avLst/>
+                    </a:prstGeom>
+                  </pic:spPr>
+                </pic:pic>
+              </a:graphicData>
+            </a:graphic>
+          </wp:inline>
+        </w:drawing>
+      </w:r>
+      <w:r>
+        <w:rPr>
+          <w:b/>
+          <w:sz w:val="22"/>
+        </w:rPr>
+        <w:t xml:space="preserve">   </w:t>
+      </w:r>
+    </w:p>
+    <w:p>
+      <w:pPr>
+        <w:ind w:right="452"/>
+      </w:pPr>
+      <w:r>
+        <w:rPr>
+          <w:b/>
+          <w:sz w:val="22"/>
+        </w:rPr>
+        <w:t xml:space="preserve"> </w:t>
+      </w:r>
+      <w:r>
+        <w:rPr>
+          <w:b/>
+          <w:sz w:val="22"/>
+        </w:rPr>
+        <w:tab/>
+      </w:r>
+      <w:proofErr w:type="spellStart"/>
+      <w:r>
+        <w:t>Neptita</w:t>
+      </w:r>
+      <w:proofErr w:type="spellEnd"/>
+      <w:r>
+        <w:t xml:space="preserve"> </w:t>
+      </w:r>
+      <w:r>
+        <w:t>mais forte e resistente que o “</w:t>
+      </w:r>
+      <w:proofErr w:type="spellStart"/>
+      <w:r>
+        <w:t>Curiotita</w:t>
+      </w:r>
+      <w:proofErr w:type="spellEnd"/>
+      <w:r>
+        <w:t xml:space="preserve">”, </w:t>
+      </w:r>
+      <w:r>
+        <w:t>também nas camadas de ardósias abissais</w:t>
+      </w:r>
+      <w:r>
+        <w:t>, e só pode ser adquirido após o avanço dos equipamentos de “</w:t>
+      </w:r>
+      <w:proofErr w:type="spellStart"/>
+      <w:r>
+        <w:t>Curiotita</w:t>
+      </w:r>
+      <w:proofErr w:type="spellEnd"/>
+      <w:r>
+        <w:t xml:space="preserve">”. </w:t>
+      </w:r>
+    </w:p>
+    <w:p>
+      <w:pPr>
+        <w:spacing w:after="0" w:line="259" w:lineRule="auto"/>
+        <w:ind w:left="0" w:firstLine="0"/>
+      </w:pPr>
+      <w:r>
+        <w:t xml:space="preserve"> </w:t>
+      </w:r>
+    </w:p>
+    <w:p>
+      <w:pPr>
+        <w:numPr>
+          <w:ilvl w:val="0"/>
+          <w:numId w:val="7"/>
+        </w:numPr>
+        <w:spacing w:after="4" w:line="259" w:lineRule="auto"/>
+        <w:ind w:hanging="165"/>
+      </w:pPr>
+      <w:r>
+        <w:rPr>
+          <w:b/>
+          <w:sz w:val="22"/>
+        </w:rPr>
+        <w:t xml:space="preserve">- Minério de </w:t>
+      </w:r>
+      <w:proofErr w:type="spellStart"/>
+      <w:r>
+        <w:rPr>
+          <w:b/>
+          <w:sz w:val="22"/>
+        </w:rPr>
         <w:t>Emeritio</w:t>
       </w:r>
       <w:proofErr w:type="spellEnd"/>
       <w:r>
-        <w:t>)</w:t>
-      </w:r>
-      <w:r>
-        <w:br/>
+        <w:rPr>
+          <w:b/>
+          <w:sz w:val="22"/>
+        </w:rPr>
+        <w:t xml:space="preserve">:  </w:t>
+      </w:r>
+    </w:p>
+    <w:p>
+      <w:pPr>
+        <w:spacing w:line="259" w:lineRule="auto"/>
+        <w:ind w:left="0" w:firstLine="0"/>
+      </w:pPr>
+      <w:r>
+        <w:rPr>
+          <w:b/>
+          <w:sz w:val="22"/>
+        </w:rPr>
+        <w:t xml:space="preserve">  </w:t>
+      </w:r>
+      <w:r>
+        <w:rPr>
+          <w:b/>
+          <w:sz w:val="22"/>
+        </w:rPr>
+        <w:t xml:space="preserve"> </w:t>
       </w:r>
       <w:r>
         <w:rPr>
           <w:noProof/>
         </w:rPr>
         <w:drawing>
-          <wp:inline distT="0" distB="0" distL="0" distR="0" wp14:anchorId="6FD5486F" wp14:editId="5305E60D">
-            <wp:extent cx="3778250" cy="2171277"/>
-            <wp:effectExtent l="0" t="0" r="0" b="635"/>
-            <wp:docPr id="537585212" name="Imagem 1"/>
+          <wp:inline distT="0" distB="0" distL="0" distR="0" wp14:anchorId="297A4760" wp14:editId="26A6B205">
+            <wp:extent cx="4558252" cy="2120900"/>
+            <wp:effectExtent l="0" t="0" r="0" b="0"/>
+            <wp:docPr id="1953722715" name="Imagem 1"/>
             <wp:cNvGraphicFramePr>
               <a:graphicFrameLocks xmlns:a="http://schemas.openxmlformats.org/drawingml/2006/main" noChangeAspect="1"/>
             </wp:cNvGraphicFramePr>
@@ -4636,7 +4341,7 @@
                     <pic:cNvPicPr/>
                   </pic:nvPicPr>
                   <pic:blipFill>
-                    <a:blip r:embed="rId20"/>
+                    <a:blip r:embed="rId21"/>
                     <a:stretch>
                       <a:fillRect/>
                     </a:stretch>
@@ -4644,7 +4349,7 @@
                   <pic:spPr>
                     <a:xfrm>
                       <a:off x="0" y="0"/>
-                      <a:ext cx="3798843" cy="2183111"/>
+                      <a:ext cx="4585716" cy="2133679"/>
                     </a:xfrm>
                     <a:prstGeom prst="rect">
                       <a:avLst/>
@@ -4656,42 +4361,102 @@
           </wp:inline>
         </w:drawing>
       </w:r>
-      <w:r>
-        <w:br/>
-      </w:r>
-      <w:r>
-        <w:t>5.</w:t>
-      </w:r>
-      <w:r>
-        <w:t>4</w:t>
-      </w:r>
-      <w:r>
-        <w:t xml:space="preserve">   Protótipos de Tela </w:t>
-      </w:r>
-      <w:r>
-        <w:t>(</w:t>
+    </w:p>
+    <w:p>
+      <w:pPr>
+        <w:ind w:right="452"/>
+      </w:pPr>
+      <w:r>
+        <w:rPr>
+          <w:b/>
+          <w:sz w:val="22"/>
+        </w:rPr>
+        <w:t xml:space="preserve"> </w:t>
+      </w:r>
+      <w:r>
+        <w:rPr>
+          <w:b/>
+          <w:sz w:val="22"/>
+        </w:rPr>
+        <w:tab/>
+      </w:r>
+      <w:r>
+        <w:t xml:space="preserve">Minério um pouco mais avançado dentro da modificação, resistência avançada e força acima de </w:t>
       </w:r>
       <w:proofErr w:type="spellStart"/>
       <w:r>
+        <w:t>netherita</w:t>
+      </w:r>
+      <w:proofErr w:type="spellEnd"/>
+      <w:r>
+        <w:t>, encontrado nas camadas de ardósias abissais e com chances de geração pouco parecidas com a geração do diamante, necessário equipamentos de “</w:t>
+      </w:r>
+      <w:proofErr w:type="spellStart"/>
+      <w:r>
+        <w:t>Neptita</w:t>
+      </w:r>
+      <w:proofErr w:type="spellEnd"/>
+      <w:r>
+        <w:t xml:space="preserve">” para obtenção do minério. </w:t>
+      </w:r>
+    </w:p>
+    <w:p>
+      <w:pPr>
+        <w:spacing w:after="0" w:line="259" w:lineRule="auto"/>
+        <w:ind w:left="0" w:firstLine="0"/>
+      </w:pPr>
+      <w:r>
+        <w:t xml:space="preserve"> </w:t>
+      </w:r>
+    </w:p>
+    <w:p>
+      <w:pPr>
+        <w:numPr>
+          <w:ilvl w:val="0"/>
+          <w:numId w:val="7"/>
+        </w:numPr>
+        <w:spacing w:after="4" w:line="259" w:lineRule="auto"/>
+        <w:ind w:hanging="165"/>
+      </w:pPr>
+      <w:r>
+        <w:rPr>
+          <w:b/>
+          <w:sz w:val="22"/>
+        </w:rPr>
+        <w:t xml:space="preserve">- Minério de </w:t>
+      </w:r>
+      <w:proofErr w:type="spellStart"/>
+      <w:r>
+        <w:rPr>
+          <w:b/>
+          <w:sz w:val="22"/>
+        </w:rPr>
         <w:t>Celesio</w:t>
       </w:r>
       <w:proofErr w:type="spellEnd"/>
       <w:r>
-        <w:t>)</w:t>
-      </w:r>
-      <w:r>
-        <w:br/>
-      </w:r>
+        <w:rPr>
+          <w:b/>
+          <w:sz w:val="22"/>
+        </w:rPr>
+        <w:t xml:space="preserve">:  </w:t>
+      </w:r>
+    </w:p>
+    <w:p>
+      <w:pPr>
+        <w:spacing w:after="4" w:line="259" w:lineRule="auto"/>
+        <w:ind w:left="165" w:firstLine="0"/>
+      </w:pPr>
       <w:r>
         <w:rPr>
           <w:noProof/>
         </w:rPr>
         <w:lastRenderedPageBreak/>
         <w:drawing>
-          <wp:inline distT="0" distB="0" distL="0" distR="0" wp14:anchorId="742E94CB" wp14:editId="07DBDE66">
-            <wp:extent cx="3841750" cy="2108195"/>
-            <wp:effectExtent l="0" t="0" r="6350" b="6985"/>
-            <wp:docPr id="1858224987" name="Imagem 1"/>
+          <wp:inline distT="0" distB="0" distL="0" distR="0" wp14:anchorId="0ED627EE" wp14:editId="0B2F50E1">
+            <wp:extent cx="4565650" cy="2505441"/>
+            <wp:effectExtent l="0" t="0" r="6350" b="9525"/>
+            <wp:docPr id="1325405111" name="Imagem 1"/>
             <wp:cNvGraphicFramePr>
               <a:graphicFrameLocks xmlns:a="http://schemas.openxmlformats.org/drawingml/2006/main" noChangeAspect="1"/>
             </wp:cNvGraphicFramePr>
@@ -4703,7 +4468,7 @@
                     <pic:cNvPicPr/>
                   </pic:nvPicPr>
                   <pic:blipFill>
-                    <a:blip r:embed="rId21"/>
+                    <a:blip r:embed="rId22"/>
                     <a:stretch>
                       <a:fillRect/>
                     </a:stretch>
@@ -4711,7 +4476,7 @@
                   <pic:spPr>
                     <a:xfrm>
                       <a:off x="0" y="0"/>
-                      <a:ext cx="3865866" cy="2121429"/>
+                      <a:ext cx="4616124" cy="2533139"/>
                     </a:xfrm>
                     <a:prstGeom prst="rect">
                       <a:avLst/>
@@ -4723,31 +4488,87 @@
           </wp:inline>
         </w:drawing>
       </w:r>
-      <w:r>
-        <w:br/>
-      </w:r>
-      <w:r>
-        <w:t>5.</w:t>
-      </w:r>
-      <w:r>
-        <w:t>5</w:t>
-      </w:r>
-      <w:r>
-        <w:t xml:space="preserve">   Protótipos de Tela </w:t>
-      </w:r>
-      <w:r>
-        <w:t>(</w:t>
+    </w:p>
+    <w:p>
+      <w:pPr>
+        <w:spacing w:after="0" w:line="253" w:lineRule="auto"/>
+        <w:ind w:left="0" w:right="507" w:firstLine="0"/>
+      </w:pPr>
+      <w:r>
+        <w:rPr>
+          <w:b/>
+          <w:sz w:val="22"/>
+        </w:rPr>
+        <w:t xml:space="preserve"> </w:t>
+      </w:r>
+      <w:r>
+        <w:rPr>
+          <w:b/>
+          <w:sz w:val="22"/>
+        </w:rPr>
+        <w:tab/>
+      </w:r>
+      <w:r>
+        <w:t xml:space="preserve">Minério com resistência e força avançadas, encontrado no mundo comum na camada das ardósias abissais, é necessário equipamentos de </w:t>
       </w:r>
       <w:proofErr w:type="spellStart"/>
       <w:r>
+        <w:t>netherita</w:t>
+      </w:r>
+      <w:proofErr w:type="spellEnd"/>
+      <w:r>
+        <w:t xml:space="preserve"> para obtenção do minério, taxa de geração um pouco menor que o minério de diamante. </w:t>
+      </w:r>
+    </w:p>
+    <w:p>
+      <w:pPr>
+        <w:spacing w:after="0" w:line="259" w:lineRule="auto"/>
+        <w:ind w:left="0" w:firstLine="0"/>
+      </w:pPr>
+      <w:r>
+        <w:t xml:space="preserve"> </w:t>
+      </w:r>
+    </w:p>
+    <w:p>
+      <w:pPr>
+        <w:numPr>
+          <w:ilvl w:val="0"/>
+          <w:numId w:val="7"/>
+        </w:numPr>
+        <w:spacing w:after="4" w:line="259" w:lineRule="auto"/>
+        <w:ind w:hanging="165"/>
+      </w:pPr>
+      <w:r>
+        <w:rPr>
+          <w:b/>
+          <w:sz w:val="22"/>
+        </w:rPr>
+        <w:t xml:space="preserve">- Minério de </w:t>
+      </w:r>
+      <w:proofErr w:type="spellStart"/>
+      <w:r>
+        <w:rPr>
+          <w:b/>
+          <w:sz w:val="22"/>
+        </w:rPr>
         <w:t>Kharatio</w:t>
       </w:r>
       <w:proofErr w:type="spellEnd"/>
       <w:r>
-        <w:t>)</w:t>
-      </w:r>
-      <w:r>
-        <w:br/>
+        <w:rPr>
+          <w:b/>
+          <w:sz w:val="22"/>
+        </w:rPr>
+        <w:t xml:space="preserve">: </w:t>
+      </w:r>
+    </w:p>
+    <w:p>
+      <w:pPr>
+        <w:spacing w:after="4" w:line="259" w:lineRule="auto"/>
+        <w:ind w:left="0" w:firstLine="0"/>
+      </w:pPr>
+      <w:r>
+        <w:t xml:space="preserve"> </w:t>
       </w:r>
       <w:r>
         <w:rPr>
@@ -4755,10 +4576,10 @@
           <w:u w:val="single"/>
         </w:rPr>
         <w:drawing>
-          <wp:inline distT="0" distB="0" distL="0" distR="0" wp14:anchorId="212D5DDB" wp14:editId="65DF6FE9">
-            <wp:extent cx="3854450" cy="2133600"/>
-            <wp:effectExtent l="0" t="0" r="0" b="0"/>
-            <wp:docPr id="383892676" name="Imagem 1"/>
+          <wp:inline distT="0" distB="0" distL="0" distR="0" wp14:anchorId="6054954E" wp14:editId="20807CA9">
+            <wp:extent cx="4660900" cy="2750254"/>
+            <wp:effectExtent l="0" t="0" r="6350" b="0"/>
+            <wp:docPr id="174777444" name="Imagem 1"/>
             <wp:cNvGraphicFramePr>
               <a:graphicFrameLocks xmlns:a="http://schemas.openxmlformats.org/drawingml/2006/main" noChangeAspect="1"/>
             </wp:cNvGraphicFramePr>
@@ -4770,7 +4591,7 @@
                     <pic:cNvPicPr/>
                   </pic:nvPicPr>
                   <pic:blipFill>
-                    <a:blip r:embed="rId22"/>
+                    <a:blip r:embed="rId23"/>
                     <a:stretch>
                       <a:fillRect/>
                     </a:stretch>
@@ -4778,7 +4599,7 @@
                   <pic:spPr>
                     <a:xfrm>
                       <a:off x="0" y="0"/>
-                      <a:ext cx="3861114" cy="2137289"/>
+                      <a:ext cx="4689323" cy="2767025"/>
                     </a:xfrm>
                     <a:prstGeom prst="rect">
                       <a:avLst/>
@@ -4791,13 +4612,67 @@
         </w:drawing>
       </w:r>
     </w:p>
+    <w:p>
+      <w:pPr>
+        <w:spacing w:after="4" w:line="259" w:lineRule="auto"/>
+        <w:ind w:left="0" w:firstLine="0"/>
+        <w:rPr>
+          <w:b/>
+        </w:rPr>
+      </w:pPr>
+      <w:r>
+        <w:t xml:space="preserve"> </w:t>
+      </w:r>
+      <w:r>
+        <w:t xml:space="preserve">           </w:t>
+      </w:r>
+      <w:r>
+        <w:t>Último e o minério mais forte da modificação, o minério é encontrado no mundo comum abaixo das camadas de ardósia abissal próximo a “</w:t>
+      </w:r>
+      <w:proofErr w:type="spellStart"/>
+      <w:r>
+        <w:t>Bedrock</w:t>
+      </w:r>
+      <w:proofErr w:type="spellEnd"/>
+      <w:r>
+        <w:t xml:space="preserve">” com a taxa de geração um pouco maior que </w:t>
+      </w:r>
+      <w:proofErr w:type="spellStart"/>
+      <w:r>
+        <w:t>netherita</w:t>
+      </w:r>
+      <w:proofErr w:type="spellEnd"/>
+      <w:r>
+        <w:t xml:space="preserve">, extraído somente com ferramentas de </w:t>
+      </w:r>
+      <w:proofErr w:type="spellStart"/>
+      <w:r>
+        <w:t>netherita</w:t>
+      </w:r>
+      <w:proofErr w:type="spellEnd"/>
+      <w:r>
+        <w:t xml:space="preserve">. </w:t>
+      </w:r>
+      <w:r>
+        <w:br/>
+      </w:r>
+      <w:r>
+        <w:br/>
+      </w:r>
+    </w:p>
+    <w:p>
+      <w:pPr>
+        <w:pStyle w:val="Ttulo2"/>
+        <w:ind w:left="-5"/>
+      </w:pPr>
+    </w:p>
     <w:sectPr>
-      <w:headerReference w:type="even" r:id="rId23"/>
-      <w:headerReference w:type="default" r:id="rId24"/>
-      <w:footerReference w:type="even" r:id="rId25"/>
-      <w:footerReference w:type="default" r:id="rId26"/>
-      <w:headerReference w:type="first" r:id="rId27"/>
-      <w:footerReference w:type="first" r:id="rId28"/>
+      <w:headerReference w:type="even" r:id="rId24"/>
+      <w:headerReference w:type="default" r:id="rId25"/>
+      <w:footerReference w:type="even" r:id="rId26"/>
+      <w:footerReference w:type="default" r:id="rId27"/>
+      <w:headerReference w:type="first" r:id="rId28"/>
+      <w:footerReference w:type="first" r:id="rId29"/>
       <w:pgSz w:w="12240" w:h="15840"/>
       <w:pgMar w:top="778" w:right="976" w:bottom="1455" w:left="709" w:header="720" w:footer="720" w:gutter="0"/>
       <w:cols w:space="720"/>
@@ -7659,7 +7534,6 @@
   <w:style w:type="character" w:default="1" w:styleId="Fontepargpadro">
     <w:name w:val="Default Paragraph Font"/>
     <w:uiPriority w:val="1"/>
-    <w:semiHidden/>
     <w:unhideWhenUsed/>
   </w:style>
   <w:style w:type="table" w:default="1" w:styleId="Tabelanormal">

</xml_diff>